<commit_message>
docs(pgc): incluir changelog, read.ai e atualizar plano de projeto
</commit_message>
<xml_diff>
--- a/docs/sistema/004-gerencia-configuracao/PGC-Plano_de_Gerencia_de_Configuracao_AlumiGest.docx
+++ b/docs/sistema/004-gerencia-configuracao/PGC-Plano_de_Gerencia_de_Configuracao_AlumiGest.docx
@@ -1015,45 +1015,78 @@
             <w:pPr>
               <w:rPr>
                 <w:rFonts w:ascii="Arial" w:cs="Arial" w:eastAsia="Arial" w:hAnsi="Arial"/>
+                <w:sz w:val="20"/>
+                <w:szCs w:val="20"/>
                 <w:vertAlign w:val="baseline"/>
               </w:rPr>
             </w:pPr>
             <w:r>
               <w:rPr>
-                <w:rtl w:val="0"/>
-              </w:rPr>
-            </w:r>
-          </w:p>
-        </w:tc>
-        <w:tc>
-          <w:tcPr>
-            <w:vAlign w:val="top"/>
-          </w:tcPr>
-          <w:p>
-            <w:pPr>
-              <w:rPr>
-                <w:rFonts w:ascii="Arial" w:cs="Arial" w:eastAsia="Arial" w:hAnsi="Arial"/>
+                <w:rFonts w:ascii="Arial" w:cs="Arial" w:eastAsia="Arial" w:hAnsi="Arial"/>
+                <w:sz w:val="20"/>
+                <w:szCs w:val="20"/>
+                <w:rtl w:val="0"/>
+              </w:rPr>
+              <w:t xml:space="preserve">05/08/2026</w:t>
+            </w:r>
+            <w:r>
+              <w:rPr>
+                <w:rtl w:val="0"/>
+              </w:rPr>
+            </w:r>
+          </w:p>
+        </w:tc>
+        <w:tc>
+          <w:tcPr>
+            <w:vAlign w:val="top"/>
+          </w:tcPr>
+          <w:p>
+            <w:pPr>
+              <w:rPr>
+                <w:rFonts w:ascii="Arial" w:cs="Arial" w:eastAsia="Arial" w:hAnsi="Arial"/>
+                <w:sz w:val="20"/>
+                <w:szCs w:val="20"/>
                 <w:vertAlign w:val="baseline"/>
               </w:rPr>
             </w:pPr>
             <w:r>
               <w:rPr>
-                <w:rtl w:val="0"/>
-              </w:rPr>
-            </w:r>
-          </w:p>
-        </w:tc>
-        <w:tc>
-          <w:tcPr>
-            <w:vAlign w:val="top"/>
-          </w:tcPr>
-          <w:p>
-            <w:pPr>
-              <w:rPr>
-                <w:rFonts w:ascii="Arial" w:cs="Arial" w:eastAsia="Arial" w:hAnsi="Arial"/>
+                <w:rFonts w:ascii="Arial" w:cs="Arial" w:eastAsia="Arial" w:hAnsi="Arial"/>
+                <w:sz w:val="20"/>
+                <w:szCs w:val="20"/>
+                <w:rtl w:val="0"/>
+              </w:rPr>
+              <w:t xml:space="preserve">Ajustes após reunião com orientador (adição deferramentas : ChangeLog e Read.ai)</w:t>
+            </w:r>
+            <w:r>
+              <w:rPr>
+                <w:rtl w:val="0"/>
+              </w:rPr>
+            </w:r>
+          </w:p>
+        </w:tc>
+        <w:tc>
+          <w:tcPr>
+            <w:vAlign w:val="top"/>
+          </w:tcPr>
+          <w:p>
+            <w:pPr>
+              <w:rPr>
+                <w:rFonts w:ascii="Arial" w:cs="Arial" w:eastAsia="Arial" w:hAnsi="Arial"/>
+                <w:sz w:val="20"/>
+                <w:szCs w:val="20"/>
                 <w:vertAlign w:val="baseline"/>
               </w:rPr>
             </w:pPr>
+            <w:r>
+              <w:rPr>
+                <w:rFonts w:ascii="Arial" w:cs="Arial" w:eastAsia="Arial" w:hAnsi="Arial"/>
+                <w:sz w:val="20"/>
+                <w:szCs w:val="20"/>
+                <w:rtl w:val="0"/>
+              </w:rPr>
+              <w:t xml:space="preserve">Nichollas</w:t>
+            </w:r>
             <w:r>
               <w:rPr>
                 <w:rtl w:val="0"/>
@@ -1075,6 +1108,8 @@
             <w:pPr>
               <w:rPr>
                 <w:rFonts w:ascii="Arial" w:cs="Arial" w:eastAsia="Arial" w:hAnsi="Arial"/>
+                <w:sz w:val="20"/>
+                <w:szCs w:val="20"/>
                 <w:vertAlign w:val="baseline"/>
               </w:rPr>
             </w:pPr>
@@ -1093,6 +1128,8 @@
             <w:pPr>
               <w:rPr>
                 <w:rFonts w:ascii="Arial" w:cs="Arial" w:eastAsia="Arial" w:hAnsi="Arial"/>
+                <w:sz w:val="20"/>
+                <w:szCs w:val="20"/>
                 <w:vertAlign w:val="baseline"/>
               </w:rPr>
             </w:pPr>
@@ -1111,6 +1148,8 @@
             <w:pPr>
               <w:rPr>
                 <w:rFonts w:ascii="Arial" w:cs="Arial" w:eastAsia="Arial" w:hAnsi="Arial"/>
+                <w:sz w:val="20"/>
+                <w:szCs w:val="20"/>
                 <w:vertAlign w:val="baseline"/>
               </w:rPr>
             </w:pPr>
@@ -1135,6 +1174,8 @@
             <w:pPr>
               <w:rPr>
                 <w:rFonts w:ascii="Arial" w:cs="Arial" w:eastAsia="Arial" w:hAnsi="Arial"/>
+                <w:sz w:val="20"/>
+                <w:szCs w:val="20"/>
                 <w:vertAlign w:val="baseline"/>
               </w:rPr>
             </w:pPr>
@@ -1153,6 +1194,8 @@
             <w:pPr>
               <w:rPr>
                 <w:rFonts w:ascii="Arial" w:cs="Arial" w:eastAsia="Arial" w:hAnsi="Arial"/>
+                <w:sz w:val="20"/>
+                <w:szCs w:val="20"/>
                 <w:vertAlign w:val="baseline"/>
               </w:rPr>
             </w:pPr>
@@ -1171,6 +1214,8 @@
             <w:pPr>
               <w:rPr>
                 <w:rFonts w:ascii="Arial" w:cs="Arial" w:eastAsia="Arial" w:hAnsi="Arial"/>
+                <w:sz w:val="20"/>
+                <w:szCs w:val="20"/>
                 <w:vertAlign w:val="baseline"/>
               </w:rPr>
             </w:pPr>
@@ -1195,6 +1240,8 @@
             <w:pPr>
               <w:rPr>
                 <w:rFonts w:ascii="Arial" w:cs="Arial" w:eastAsia="Arial" w:hAnsi="Arial"/>
+                <w:sz w:val="20"/>
+                <w:szCs w:val="20"/>
                 <w:vertAlign w:val="baseline"/>
               </w:rPr>
             </w:pPr>
@@ -1213,6 +1260,8 @@
             <w:pPr>
               <w:rPr>
                 <w:rFonts w:ascii="Arial" w:cs="Arial" w:eastAsia="Arial" w:hAnsi="Arial"/>
+                <w:sz w:val="20"/>
+                <w:szCs w:val="20"/>
                 <w:vertAlign w:val="baseline"/>
               </w:rPr>
             </w:pPr>
@@ -1231,6 +1280,8 @@
             <w:pPr>
               <w:rPr>
                 <w:rFonts w:ascii="Arial" w:cs="Arial" w:eastAsia="Arial" w:hAnsi="Arial"/>
+                <w:sz w:val="20"/>
+                <w:szCs w:val="20"/>
                 <w:vertAlign w:val="baseline"/>
               </w:rPr>
             </w:pPr>
@@ -1255,6 +1306,8 @@
             <w:pPr>
               <w:rPr>
                 <w:rFonts w:ascii="Arial" w:cs="Arial" w:eastAsia="Arial" w:hAnsi="Arial"/>
+                <w:sz w:val="20"/>
+                <w:szCs w:val="20"/>
                 <w:vertAlign w:val="baseline"/>
               </w:rPr>
             </w:pPr>
@@ -1273,6 +1326,8 @@
             <w:pPr>
               <w:rPr>
                 <w:rFonts w:ascii="Arial" w:cs="Arial" w:eastAsia="Arial" w:hAnsi="Arial"/>
+                <w:sz w:val="20"/>
+                <w:szCs w:val="20"/>
                 <w:vertAlign w:val="baseline"/>
               </w:rPr>
             </w:pPr>
@@ -1291,6 +1346,8 @@
             <w:pPr>
               <w:rPr>
                 <w:rFonts w:ascii="Arial" w:cs="Arial" w:eastAsia="Arial" w:hAnsi="Arial"/>
+                <w:sz w:val="20"/>
+                <w:szCs w:val="20"/>
                 <w:vertAlign w:val="baseline"/>
               </w:rPr>
             </w:pPr>
@@ -1315,6 +1372,8 @@
             <w:pPr>
               <w:rPr>
                 <w:rFonts w:ascii="Arial" w:cs="Arial" w:eastAsia="Arial" w:hAnsi="Arial"/>
+                <w:sz w:val="20"/>
+                <w:szCs w:val="20"/>
                 <w:vertAlign w:val="baseline"/>
               </w:rPr>
             </w:pPr>
@@ -1333,6 +1392,8 @@
             <w:pPr>
               <w:rPr>
                 <w:rFonts w:ascii="Arial" w:cs="Arial" w:eastAsia="Arial" w:hAnsi="Arial"/>
+                <w:sz w:val="20"/>
+                <w:szCs w:val="20"/>
                 <w:vertAlign w:val="baseline"/>
               </w:rPr>
             </w:pPr>
@@ -1351,6 +1412,8 @@
             <w:pPr>
               <w:rPr>
                 <w:rFonts w:ascii="Arial" w:cs="Arial" w:eastAsia="Arial" w:hAnsi="Arial"/>
+                <w:sz w:val="20"/>
+                <w:szCs w:val="20"/>
                 <w:vertAlign w:val="baseline"/>
               </w:rPr>
             </w:pPr>
@@ -1375,6 +1438,8 @@
             <w:pPr>
               <w:rPr>
                 <w:rFonts w:ascii="Arial" w:cs="Arial" w:eastAsia="Arial" w:hAnsi="Arial"/>
+                <w:sz w:val="20"/>
+                <w:szCs w:val="20"/>
                 <w:vertAlign w:val="baseline"/>
               </w:rPr>
             </w:pPr>
@@ -1393,6 +1458,8 @@
             <w:pPr>
               <w:rPr>
                 <w:rFonts w:ascii="Arial" w:cs="Arial" w:eastAsia="Arial" w:hAnsi="Arial"/>
+                <w:sz w:val="20"/>
+                <w:szCs w:val="20"/>
                 <w:vertAlign w:val="baseline"/>
               </w:rPr>
             </w:pPr>
@@ -1411,6 +1478,8 @@
             <w:pPr>
               <w:rPr>
                 <w:rFonts w:ascii="Arial" w:cs="Arial" w:eastAsia="Arial" w:hAnsi="Arial"/>
+                <w:sz w:val="20"/>
+                <w:szCs w:val="20"/>
                 <w:vertAlign w:val="baseline"/>
               </w:rPr>
             </w:pPr>
@@ -1435,6 +1504,8 @@
             <w:pPr>
               <w:rPr>
                 <w:rFonts w:ascii="Arial" w:cs="Arial" w:eastAsia="Arial" w:hAnsi="Arial"/>
+                <w:sz w:val="20"/>
+                <w:szCs w:val="20"/>
                 <w:vertAlign w:val="baseline"/>
               </w:rPr>
             </w:pPr>
@@ -1453,6 +1524,8 @@
             <w:pPr>
               <w:rPr>
                 <w:rFonts w:ascii="Arial" w:cs="Arial" w:eastAsia="Arial" w:hAnsi="Arial"/>
+                <w:sz w:val="20"/>
+                <w:szCs w:val="20"/>
                 <w:vertAlign w:val="baseline"/>
               </w:rPr>
             </w:pPr>
@@ -1471,6 +1544,8 @@
             <w:pPr>
               <w:rPr>
                 <w:rFonts w:ascii="Arial" w:cs="Arial" w:eastAsia="Arial" w:hAnsi="Arial"/>
+                <w:sz w:val="20"/>
+                <w:szCs w:val="20"/>
                 <w:vertAlign w:val="baseline"/>
               </w:rPr>
             </w:pPr>
@@ -1532,7 +1607,7 @@
     </w:p>
     <w:sdt>
       <w:sdtPr>
-        <w:id w:val="-1108236363"/>
+        <w:id w:val="1390056697"/>
         <w:docPartObj>
           <w:docPartGallery w:val="Table of Contents"/>
           <w:docPartUnique w:val="1"/>
@@ -3054,7 +3129,7 @@
         <w:pStyle w:val="Heading1"/>
         <w:numPr>
           <w:ilvl w:val="0"/>
-          <w:numId w:val="2"/>
+          <w:numId w:val="3"/>
         </w:numPr>
         <w:ind w:left="432" w:hanging="432"/>
         <w:rPr/>
@@ -3135,7 +3210,7 @@
         <w:pStyle w:val="Heading2"/>
         <w:numPr>
           <w:ilvl w:val="1"/>
-          <w:numId w:val="2"/>
+          <w:numId w:val="3"/>
         </w:numPr>
         <w:ind w:left="576" w:hanging="576"/>
         <w:rPr/>
@@ -3218,7 +3293,7 @@
         <w:pStyle w:val="Heading3"/>
         <w:numPr>
           <w:ilvl w:val="2"/>
-          <w:numId w:val="2"/>
+          <w:numId w:val="3"/>
         </w:numPr>
         <w:spacing w:after="120" w:before="120" w:lineRule="auto"/>
         <w:ind w:left="720" w:hanging="720"/>
@@ -3690,7 +3765,7 @@
         <w:pStyle w:val="Heading1"/>
         <w:numPr>
           <w:ilvl w:val="0"/>
-          <w:numId w:val="2"/>
+          <w:numId w:val="3"/>
         </w:numPr>
         <w:ind w:left="432" w:hanging="432"/>
         <w:rPr/>
@@ -3856,7 +3931,24 @@
                 <w:color w:val="000000"/>
                 <w:rtl w:val="0"/>
               </w:rPr>
-              <w:t xml:space="preserve">Papel exercido de forma fixa por José Guilherme. Responsável por priorizar o Product Backlog, definir critérios de aceitação, intermediar a comunicação com o parceiro social (Thiago/Alumiportas) e validar as releases.</w:t>
+              <w:t xml:space="preserve">Papel exercido de forma fixa por José Gu</w:t>
+            </w:r>
+            <w:r>
+              <w:rPr>
+                <w:rFonts w:ascii="Arial" w:cs="Arial" w:eastAsia="Arial" w:hAnsi="Arial"/>
+                <w:rtl w:val="0"/>
+              </w:rPr>
+              <w:t xml:space="preserve">yl</w:t>
+            </w:r>
+            <w:r>
+              <w:rPr>
+                <w:rFonts w:ascii="Arial" w:cs="Arial" w:eastAsia="Arial" w:hAnsi="Arial"/>
+                <w:i w:val="0"/>
+                <w:iCs w:val="0"/>
+                <w:color w:val="000000"/>
+                <w:rtl w:val="0"/>
+              </w:rPr>
+              <w:t xml:space="preserve">herme. Responsável por priorizar o Product Backlog, definir critérios de aceitação, intermediar a comunicação com o parceiro social (Thiago/Alumiportas) e validar as releases.</w:t>
             </w:r>
             <w:r>
               <w:rPr>
@@ -3890,7 +3982,24 @@
                 <w:color w:val="000000"/>
                 <w:rtl w:val="0"/>
               </w:rPr>
-              <w:t xml:space="preserve">Gerente de Projeto / Scrum Master (LP)</w:t>
+              <w:t xml:space="preserve">Gerente de Projeto / Scrum Master (</w:t>
+            </w:r>
+            <w:r>
+              <w:rPr>
+                <w:rFonts w:ascii="Arial" w:cs="Arial" w:eastAsia="Arial" w:hAnsi="Arial"/>
+                <w:rtl w:val="0"/>
+              </w:rPr>
+              <w:t xml:space="preserve">G</w:t>
+            </w:r>
+            <w:r>
+              <w:rPr>
+                <w:rFonts w:ascii="Arial" w:cs="Arial" w:eastAsia="Arial" w:hAnsi="Arial"/>
+                <w:i w:val="0"/>
+                <w:iCs w:val="0"/>
+                <w:color w:val="000000"/>
+                <w:rtl w:val="0"/>
+              </w:rPr>
+              <w:t xml:space="preserve">P)</w:t>
             </w:r>
             <w:r>
               <w:rPr>
@@ -4267,7 +4376,7 @@
         <w:pStyle w:val="Heading1"/>
         <w:numPr>
           <w:ilvl w:val="0"/>
-          <w:numId w:val="2"/>
+          <w:numId w:val="3"/>
         </w:numPr>
         <w:ind w:left="432" w:hanging="432"/>
         <w:rPr/>
@@ -4292,7 +4401,7 @@
         <w:pStyle w:val="Heading2"/>
         <w:numPr>
           <w:ilvl w:val="1"/>
-          <w:numId w:val="2"/>
+          <w:numId w:val="3"/>
         </w:numPr>
         <w:ind w:left="576" w:hanging="576"/>
         <w:rPr/>
@@ -4343,7 +4452,7 @@
         <w:pStyle w:val="Heading3"/>
         <w:numPr>
           <w:ilvl w:val="2"/>
-          <w:numId w:val="2"/>
+          <w:numId w:val="3"/>
         </w:numPr>
         <w:ind w:left="720" w:hanging="720"/>
         <w:rPr/>
@@ -5521,7 +5630,7 @@
         <w:pStyle w:val="Heading1"/>
         <w:numPr>
           <w:ilvl w:val="0"/>
-          <w:numId w:val="2"/>
+          <w:numId w:val="3"/>
         </w:numPr>
         <w:ind w:left="432" w:hanging="432"/>
         <w:rPr/>
@@ -5544,7 +5653,7 @@
         <w:pStyle w:val="Heading2"/>
         <w:numPr>
           <w:ilvl w:val="1"/>
-          <w:numId w:val="2"/>
+          <w:numId w:val="3"/>
         </w:numPr>
         <w:ind w:left="576" w:hanging="576"/>
         <w:rPr/>
@@ -6542,7 +6651,7 @@
         <w:pStyle w:val="Heading2"/>
         <w:numPr>
           <w:ilvl w:val="1"/>
-          <w:numId w:val="2"/>
+          <w:numId w:val="3"/>
         </w:numPr>
         <w:ind w:left="576" w:hanging="576"/>
         <w:rPr/>
@@ -6649,15 +6758,128 @@
         <w:br w:type="textWrapping"/>
         <w:t xml:space="preserve"> As versões são registradas como tags Git no repositório GitHub. A documentação segue versionamento próprio, onde cada atualização incrementa o número da revisão registrado na tabela de revisões do documento.</w:t>
       </w:r>
-      <w:r>
-        <w:rPr>
-          <w:rtl w:val="0"/>
-        </w:rPr>
-      </w:r>
-    </w:p>
-    <w:p>
-      <w:pPr>
-        <w:ind w:firstLine="576"/>
+    </w:p>
+    <w:p>
+      <w:pPr>
+        <w:ind w:left="0" w:firstLine="720"/>
+        <w:rPr>
+          <w:rFonts w:ascii="Arial" w:cs="Arial" w:eastAsia="Arial" w:hAnsi="Arial"/>
+        </w:rPr>
+      </w:pPr>
+      <w:r>
+        <w:rPr>
+          <w:rFonts w:ascii="Arial" w:cs="Arial" w:eastAsia="Arial" w:hAnsi="Arial"/>
+          <w:rtl w:val="0"/>
+        </w:rPr>
+        <w:br w:type="textWrapping"/>
+        <w:tab/>
+        <w:t xml:space="preserve">Para manter a rastreabilidade contínua entre as versões, o projeto adota o padrão Keep a Changelog através do arquivo CHANGELOG.md localizado na raiz do repositório. O Changelog registra cronologicamente todas as modificações introduzidas a cada versão, organizadas nas seguintes categorias:</w:t>
+      </w:r>
+    </w:p>
+    <w:p>
+      <w:pPr>
+        <w:ind w:left="720" w:firstLine="0"/>
+        <w:rPr>
+          <w:rFonts w:ascii="Arial" w:cs="Arial" w:eastAsia="Arial" w:hAnsi="Arial"/>
+        </w:rPr>
+      </w:pPr>
+      <w:r>
+        <w:rPr>
+          <w:rtl w:val="0"/>
+        </w:rPr>
+      </w:r>
+    </w:p>
+    <w:p>
+      <w:pPr>
+        <w:numPr>
+          <w:ilvl w:val="0"/>
+          <w:numId w:val="2"/>
+        </w:numPr>
+        <w:ind w:left="720" w:hanging="360"/>
+        <w:rPr>
+          <w:rFonts w:ascii="Arial" w:cs="Arial" w:eastAsia="Arial" w:hAnsi="Arial"/>
+          <w:u w:val="none"/>
+        </w:rPr>
+      </w:pPr>
+      <w:r>
+        <w:rPr>
+          <w:rFonts w:ascii="Arial" w:cs="Arial" w:eastAsia="Arial" w:hAnsi="Arial"/>
+          <w:rtl w:val="0"/>
+        </w:rPr>
+        <w:t xml:space="preserve">Adicionado (Added): Novas funcionalidades e módulos implementados;</w:t>
+        <w:br w:type="textWrapping"/>
+      </w:r>
+    </w:p>
+    <w:p>
+      <w:pPr>
+        <w:numPr>
+          <w:ilvl w:val="0"/>
+          <w:numId w:val="2"/>
+        </w:numPr>
+        <w:ind w:left="720" w:hanging="360"/>
+        <w:rPr>
+          <w:rFonts w:ascii="Arial" w:cs="Arial" w:eastAsia="Arial" w:hAnsi="Arial"/>
+          <w:u w:val="none"/>
+        </w:rPr>
+      </w:pPr>
+      <w:r>
+        <w:rPr>
+          <w:rFonts w:ascii="Arial" w:cs="Arial" w:eastAsia="Arial" w:hAnsi="Arial"/>
+          <w:rtl w:val="0"/>
+        </w:rPr>
+        <w:t xml:space="preserve">Modificado (Changed): Alterações em funcionalidades existentes ou regras de cálculo;</w:t>
+        <w:br w:type="textWrapping"/>
+      </w:r>
+    </w:p>
+    <w:p>
+      <w:pPr>
+        <w:numPr>
+          <w:ilvl w:val="0"/>
+          <w:numId w:val="2"/>
+        </w:numPr>
+        <w:ind w:left="720" w:hanging="360"/>
+        <w:rPr>
+          <w:rFonts w:ascii="Arial" w:cs="Arial" w:eastAsia="Arial" w:hAnsi="Arial"/>
+          <w:u w:val="none"/>
+        </w:rPr>
+      </w:pPr>
+      <w:r>
+        <w:rPr>
+          <w:rFonts w:ascii="Arial" w:cs="Arial" w:eastAsia="Arial" w:hAnsi="Arial"/>
+          <w:rtl w:val="0"/>
+        </w:rPr>
+        <w:t xml:space="preserve">Corrigido (Fixed): Correções de erros e bugs homologados;</w:t>
+        <w:br w:type="textWrapping"/>
+      </w:r>
+    </w:p>
+    <w:p>
+      <w:pPr>
+        <w:numPr>
+          <w:ilvl w:val="0"/>
+          <w:numId w:val="2"/>
+        </w:numPr>
+        <w:ind w:left="720" w:hanging="360"/>
+        <w:rPr>
+          <w:rFonts w:ascii="Arial" w:cs="Arial" w:eastAsia="Arial" w:hAnsi="Arial"/>
+          <w:u w:val="none"/>
+        </w:rPr>
+      </w:pPr>
+      <w:r>
+        <w:rPr>
+          <w:rFonts w:ascii="Arial" w:cs="Arial" w:eastAsia="Arial" w:hAnsi="Arial"/>
+          <w:rtl w:val="0"/>
+        </w:rPr>
+        <w:t xml:space="preserve">Removido (Removed): Recursos descontinuados ou refatorados.</w:t>
+      </w:r>
+      <w:r>
+        <w:rPr>
+          <w:rtl w:val="0"/>
+        </w:rPr>
+      </w:r>
+    </w:p>
+    <w:p>
+      <w:pPr>
+        <w:ind w:left="720" w:firstLine="0"/>
         <w:rPr>
           <w:rFonts w:ascii="Arial" w:cs="Arial" w:eastAsia="Arial" w:hAnsi="Arial"/>
           <w:i w:val="0"/>
@@ -6668,34 +6890,199 @@
       </w:pPr>
       <w:r>
         <w:rPr>
-          <w:rFonts w:ascii="Arial" w:cs="Arial" w:eastAsia="Arial" w:hAnsi="Arial"/>
-          <w:i w:val="0"/>
-          <w:iCs w:val="0"/>
-          <w:color w:val="000000"/>
-          <w:sz w:val="22"/>
-          <w:szCs w:val="22"/>
-          <w:rtl w:val="0"/>
-        </w:rPr>
-        <w:t xml:space="preserve">.</w:t>
-      </w:r>
-      <w:r>
-        <w:rPr>
-          <w:rtl w:val="0"/>
-        </w:rPr>
-      </w:r>
-    </w:p>
-    <w:p>
-      <w:pPr>
-        <w:rPr>
-          <w:rFonts w:ascii="Arial" w:cs="Arial" w:eastAsia="Arial" w:hAnsi="Arial"/>
-          <w:i w:val="0"/>
-          <w:iCs w:val="0"/>
+          <w:rtl w:val="0"/>
+        </w:rPr>
+      </w:r>
+    </w:p>
+    <w:p>
+      <w:pPr>
+        <w:rPr>
+          <w:rFonts w:ascii="Arial" w:cs="Arial" w:eastAsia="Arial" w:hAnsi="Arial"/>
           <w:color w:val="1f497d"/>
-          <w:vertAlign w:val="baseline"/>
-        </w:rPr>
-      </w:pPr>
-      <w:bookmarkStart w:colFirst="0" w:colLast="0" w:name="_k7wmia2vqm5a" w:id="40"/>
+        </w:rPr>
+      </w:pPr>
+      <w:bookmarkStart w:colFirst="0" w:colLast="0" w:name="_g2fq482ujkim" w:id="40"/>
       <w:bookmarkEnd w:id="40"/>
+      <w:r>
+        <w:rPr>
+          <w:rtl w:val="0"/>
+        </w:rPr>
+      </w:r>
+    </w:p>
+    <w:p>
+      <w:pPr>
+        <w:rPr>
+          <w:rFonts w:ascii="Arial" w:cs="Arial" w:eastAsia="Arial" w:hAnsi="Arial"/>
+          <w:color w:val="1f497d"/>
+        </w:rPr>
+      </w:pPr>
+      <w:bookmarkStart w:colFirst="0" w:colLast="0" w:name="_r9hr9k4i1ok3" w:id="41"/>
+      <w:bookmarkEnd w:id="41"/>
+      <w:r>
+        <w:rPr>
+          <w:rtl w:val="0"/>
+        </w:rPr>
+      </w:r>
+    </w:p>
+    <w:p>
+      <w:pPr>
+        <w:rPr>
+          <w:rFonts w:ascii="Arial" w:cs="Arial" w:eastAsia="Arial" w:hAnsi="Arial"/>
+          <w:color w:val="1f497d"/>
+        </w:rPr>
+      </w:pPr>
+      <w:bookmarkStart w:colFirst="0" w:colLast="0" w:name="_wvi4m719990v" w:id="42"/>
+      <w:bookmarkEnd w:id="42"/>
+      <w:r>
+        <w:rPr>
+          <w:rtl w:val="0"/>
+        </w:rPr>
+      </w:r>
+    </w:p>
+    <w:p>
+      <w:pPr>
+        <w:rPr>
+          <w:rFonts w:ascii="Arial" w:cs="Arial" w:eastAsia="Arial" w:hAnsi="Arial"/>
+          <w:color w:val="1f497d"/>
+        </w:rPr>
+      </w:pPr>
+      <w:bookmarkStart w:colFirst="0" w:colLast="0" w:name="_8iq991azkqzd" w:id="43"/>
+      <w:bookmarkEnd w:id="43"/>
+      <w:r>
+        <w:rPr>
+          <w:rtl w:val="0"/>
+        </w:rPr>
+      </w:r>
+    </w:p>
+    <w:p>
+      <w:pPr>
+        <w:rPr>
+          <w:rFonts w:ascii="Arial" w:cs="Arial" w:eastAsia="Arial" w:hAnsi="Arial"/>
+          <w:color w:val="1f497d"/>
+        </w:rPr>
+      </w:pPr>
+      <w:bookmarkStart w:colFirst="0" w:colLast="0" w:name="_nauckdqqtlam" w:id="44"/>
+      <w:bookmarkEnd w:id="44"/>
+      <w:r>
+        <w:rPr>
+          <w:rtl w:val="0"/>
+        </w:rPr>
+      </w:r>
+    </w:p>
+    <w:p>
+      <w:pPr>
+        <w:rPr>
+          <w:rFonts w:ascii="Arial" w:cs="Arial" w:eastAsia="Arial" w:hAnsi="Arial"/>
+          <w:color w:val="1f497d"/>
+        </w:rPr>
+      </w:pPr>
+      <w:bookmarkStart w:colFirst="0" w:colLast="0" w:name="_35uxuqrrhtf1" w:id="45"/>
+      <w:bookmarkEnd w:id="45"/>
+      <w:r>
+        <w:rPr>
+          <w:rtl w:val="0"/>
+        </w:rPr>
+      </w:r>
+    </w:p>
+    <w:p>
+      <w:pPr>
+        <w:rPr>
+          <w:rFonts w:ascii="Arial" w:cs="Arial" w:eastAsia="Arial" w:hAnsi="Arial"/>
+          <w:color w:val="1f497d"/>
+        </w:rPr>
+      </w:pPr>
+      <w:bookmarkStart w:colFirst="0" w:colLast="0" w:name="_m5kkpy7ldl26" w:id="46"/>
+      <w:bookmarkEnd w:id="46"/>
+      <w:r>
+        <w:rPr>
+          <w:rtl w:val="0"/>
+        </w:rPr>
+      </w:r>
+    </w:p>
+    <w:p>
+      <w:pPr>
+        <w:rPr>
+          <w:rFonts w:ascii="Arial" w:cs="Arial" w:eastAsia="Arial" w:hAnsi="Arial"/>
+          <w:color w:val="1f497d"/>
+        </w:rPr>
+      </w:pPr>
+      <w:bookmarkStart w:colFirst="0" w:colLast="0" w:name="_pnjsw7ajg9pm" w:id="47"/>
+      <w:bookmarkEnd w:id="47"/>
+      <w:r>
+        <w:rPr>
+          <w:rtl w:val="0"/>
+        </w:rPr>
+      </w:r>
+    </w:p>
+    <w:p>
+      <w:pPr>
+        <w:rPr>
+          <w:rFonts w:ascii="Arial" w:cs="Arial" w:eastAsia="Arial" w:hAnsi="Arial"/>
+          <w:color w:val="1f497d"/>
+        </w:rPr>
+      </w:pPr>
+      <w:bookmarkStart w:colFirst="0" w:colLast="0" w:name="_firj6hr94v4w" w:id="48"/>
+      <w:bookmarkEnd w:id="48"/>
+      <w:r>
+        <w:rPr>
+          <w:rtl w:val="0"/>
+        </w:rPr>
+      </w:r>
+    </w:p>
+    <w:p>
+      <w:pPr>
+        <w:rPr>
+          <w:rFonts w:ascii="Arial" w:cs="Arial" w:eastAsia="Arial" w:hAnsi="Arial"/>
+          <w:color w:val="1f497d"/>
+        </w:rPr>
+      </w:pPr>
+      <w:bookmarkStart w:colFirst="0" w:colLast="0" w:name="_bvk0t2b6k7bx" w:id="49"/>
+      <w:bookmarkEnd w:id="49"/>
+      <w:r>
+        <w:rPr>
+          <w:rtl w:val="0"/>
+        </w:rPr>
+      </w:r>
+    </w:p>
+    <w:p>
+      <w:pPr>
+        <w:rPr>
+          <w:rFonts w:ascii="Arial" w:cs="Arial" w:eastAsia="Arial" w:hAnsi="Arial"/>
+          <w:color w:val="1f497d"/>
+        </w:rPr>
+      </w:pPr>
+      <w:bookmarkStart w:colFirst="0" w:colLast="0" w:name="_qfgphhwhytrp" w:id="50"/>
+      <w:bookmarkEnd w:id="50"/>
+      <w:r>
+        <w:rPr>
+          <w:rtl w:val="0"/>
+        </w:rPr>
+      </w:r>
+    </w:p>
+    <w:p>
+      <w:pPr>
+        <w:rPr>
+          <w:rFonts w:ascii="Arial" w:cs="Arial" w:eastAsia="Arial" w:hAnsi="Arial"/>
+          <w:color w:val="1f497d"/>
+        </w:rPr>
+      </w:pPr>
+      <w:bookmarkStart w:colFirst="0" w:colLast="0" w:name="_xcd6mt6gg7yu" w:id="51"/>
+      <w:bookmarkEnd w:id="51"/>
+      <w:r>
+        <w:rPr>
+          <w:rtl w:val="0"/>
+        </w:rPr>
+      </w:r>
+    </w:p>
+    <w:p>
+      <w:pPr>
+        <w:rPr>
+          <w:rFonts w:ascii="Arial" w:cs="Arial" w:eastAsia="Arial" w:hAnsi="Arial"/>
+          <w:color w:val="1f497d"/>
+        </w:rPr>
+      </w:pPr>
+      <w:bookmarkStart w:colFirst="0" w:colLast="0" w:name="_k7wmia2vqm5a" w:id="52"/>
+      <w:bookmarkEnd w:id="52"/>
       <w:r>
         <w:rPr>
           <w:rtl w:val="0"/>
@@ -6707,7 +7094,7 @@
         <w:pStyle w:val="Heading2"/>
         <w:numPr>
           <w:ilvl w:val="1"/>
-          <w:numId w:val="2"/>
+          <w:numId w:val="3"/>
         </w:numPr>
         <w:ind w:left="576" w:hanging="576"/>
         <w:rPr/>
@@ -6787,151 +7174,6 @@
     <w:p>
       <w:pPr>
         <w:jc w:val="center"/>
-        <w:rPr>
-          <w:rFonts w:ascii="Arial" w:cs="Arial" w:eastAsia="Arial" w:hAnsi="Arial"/>
-        </w:rPr>
-      </w:pPr>
-      <w:r>
-        <w:rPr>
-          <w:rtl w:val="0"/>
-        </w:rPr>
-      </w:r>
-    </w:p>
-    <w:p>
-      <w:pPr>
-        <w:jc w:val="both"/>
-        <w:rPr>
-          <w:rFonts w:ascii="Arial" w:cs="Arial" w:eastAsia="Arial" w:hAnsi="Arial"/>
-        </w:rPr>
-      </w:pPr>
-      <w:r>
-        <w:rPr>
-          <w:rFonts w:ascii="Arial" w:cs="Arial" w:eastAsia="Arial" w:hAnsi="Arial"/>
-          <w:rtl w:val="0"/>
-        </w:rPr>
-        <w:t xml:space="preserve">Onde:</w:t>
-      </w:r>
-    </w:p>
-    <w:p>
-      <w:pPr>
-        <w:numPr>
-          <w:ilvl w:val="0"/>
-          <w:numId w:val="3"/>
-        </w:numPr>
-        <w:ind w:left="720" w:hanging="360"/>
-        <w:jc w:val="both"/>
-        <w:rPr>
-          <w:rFonts w:ascii="Arial" w:cs="Arial" w:eastAsia="Arial" w:hAnsi="Arial"/>
-        </w:rPr>
-      </w:pPr>
-      <w:r>
-        <w:rPr>
-          <w:rFonts w:ascii="Arial" w:cs="Arial" w:eastAsia="Arial" w:hAnsi="Arial"/>
-          <w:rtl w:val="0"/>
-        </w:rPr>
-        <w:t xml:space="preserve">MAJOR.MINOR.PATCH: O identificador da versão seguindo o versionamento semântico.</w:t>
-      </w:r>
-    </w:p>
-    <w:p>
-      <w:pPr>
-        <w:numPr>
-          <w:ilvl w:val="0"/>
-          <w:numId w:val="3"/>
-        </w:numPr>
-        <w:ind w:left="720" w:hanging="360"/>
-        <w:jc w:val="both"/>
-        <w:rPr>
-          <w:rFonts w:ascii="Arial" w:cs="Arial" w:eastAsia="Arial" w:hAnsi="Arial"/>
-        </w:rPr>
-      </w:pPr>
-      <w:r>
-        <w:rPr>
-          <w:rFonts w:ascii="Arial" w:cs="Arial" w:eastAsia="Arial" w:hAnsi="Arial"/>
-          <w:rtl w:val="0"/>
-        </w:rPr>
-        <w:t xml:space="preserve">SPRINT: O número da sprint em que foi gerada a baseline.</w:t>
-      </w:r>
-    </w:p>
-    <w:p>
-      <w:pPr>
-        <w:numPr>
-          <w:ilvl w:val="0"/>
-          <w:numId w:val="3"/>
-        </w:numPr>
-        <w:ind w:left="720" w:hanging="360"/>
-        <w:jc w:val="both"/>
-        <w:rPr>
-          <w:rFonts w:ascii="Arial" w:cs="Arial" w:eastAsia="Arial" w:hAnsi="Arial"/>
-        </w:rPr>
-      </w:pPr>
-      <w:r>
-        <w:rPr>
-          <w:rFonts w:ascii="Arial" w:cs="Arial" w:eastAsia="Arial" w:hAnsi="Arial"/>
-          <w:rtl w:val="0"/>
-        </w:rPr>
-        <w:t xml:space="preserve">SEQ: O número sequencial da baseline dentro da sprint. Exemplo: B-ALG-v1.0.0-S03-01</w:t>
-      </w:r>
-    </w:p>
-    <w:p>
-      <w:pPr>
-        <w:jc w:val="both"/>
-        <w:rPr>
-          <w:rFonts w:ascii="Arial" w:cs="Arial" w:eastAsia="Arial" w:hAnsi="Arial"/>
-        </w:rPr>
-      </w:pPr>
-      <w:r>
-        <w:rPr>
-          <w:rtl w:val="0"/>
-        </w:rPr>
-      </w:r>
-    </w:p>
-    <w:p>
-      <w:pPr>
-        <w:ind w:firstLine="360"/>
-        <w:jc w:val="both"/>
-        <w:rPr>
-          <w:rFonts w:ascii="Arial" w:cs="Arial" w:eastAsia="Arial" w:hAnsi="Arial"/>
-        </w:rPr>
-      </w:pPr>
-      <w:r>
-        <w:rPr>
-          <w:rFonts w:ascii="Arial" w:cs="Arial" w:eastAsia="Arial" w:hAnsi="Arial"/>
-          <w:rtl w:val="0"/>
-        </w:rPr>
-        <w:t xml:space="preserve">As releases de sprint devem seguir a seguinte nomenclatura:</w:t>
-      </w:r>
-    </w:p>
-    <w:p>
-      <w:pPr>
-        <w:ind w:firstLine="360"/>
-        <w:jc w:val="both"/>
-        <w:rPr>
-          <w:rFonts w:ascii="Arial" w:cs="Arial" w:eastAsia="Arial" w:hAnsi="Arial"/>
-        </w:rPr>
-      </w:pPr>
-      <w:r>
-        <w:rPr>
-          <w:rtl w:val="0"/>
-        </w:rPr>
-      </w:r>
-    </w:p>
-    <w:p>
-      <w:pPr>
-        <w:jc w:val="center"/>
-        <w:rPr>
-          <w:rFonts w:ascii="Arial" w:cs="Arial" w:eastAsia="Arial" w:hAnsi="Arial"/>
-        </w:rPr>
-      </w:pPr>
-      <w:r>
-        <w:rPr>
-          <w:rFonts w:ascii="Arial" w:cs="Arial" w:eastAsia="Arial" w:hAnsi="Arial"/>
-          <w:rtl w:val="0"/>
-        </w:rPr>
-        <w:t xml:space="preserve">R-ALG-v&lt;MAJOR&gt;.&lt;MINOR&gt;.&lt;PATCH&gt;</w:t>
-      </w:r>
-    </w:p>
-    <w:p>
-      <w:pPr>
         <w:rPr>
           <w:rFonts w:ascii="Arial" w:cs="Arial" w:eastAsia="Arial" w:hAnsi="Arial"/>
         </w:rPr>
@@ -6994,6 +7236,151 @@
           <w:rFonts w:ascii="Arial" w:cs="Arial" w:eastAsia="Arial" w:hAnsi="Arial"/>
           <w:rtl w:val="0"/>
         </w:rPr>
+        <w:t xml:space="preserve">SPRINT: O número da sprint em que foi gerada a baseline.</w:t>
+      </w:r>
+    </w:p>
+    <w:p>
+      <w:pPr>
+        <w:numPr>
+          <w:ilvl w:val="0"/>
+          <w:numId w:val="4"/>
+        </w:numPr>
+        <w:ind w:left="720" w:hanging="360"/>
+        <w:jc w:val="both"/>
+        <w:rPr>
+          <w:rFonts w:ascii="Arial" w:cs="Arial" w:eastAsia="Arial" w:hAnsi="Arial"/>
+        </w:rPr>
+      </w:pPr>
+      <w:r>
+        <w:rPr>
+          <w:rFonts w:ascii="Arial" w:cs="Arial" w:eastAsia="Arial" w:hAnsi="Arial"/>
+          <w:rtl w:val="0"/>
+        </w:rPr>
+        <w:t xml:space="preserve">SEQ: O número sequencial da baseline dentro da sprint. Exemplo: B-ALG-v1.0.0-S03-01</w:t>
+      </w:r>
+    </w:p>
+    <w:p>
+      <w:pPr>
+        <w:jc w:val="both"/>
+        <w:rPr>
+          <w:rFonts w:ascii="Arial" w:cs="Arial" w:eastAsia="Arial" w:hAnsi="Arial"/>
+        </w:rPr>
+      </w:pPr>
+      <w:r>
+        <w:rPr>
+          <w:rtl w:val="0"/>
+        </w:rPr>
+      </w:r>
+    </w:p>
+    <w:p>
+      <w:pPr>
+        <w:ind w:firstLine="360"/>
+        <w:jc w:val="both"/>
+        <w:rPr>
+          <w:rFonts w:ascii="Arial" w:cs="Arial" w:eastAsia="Arial" w:hAnsi="Arial"/>
+        </w:rPr>
+      </w:pPr>
+      <w:r>
+        <w:rPr>
+          <w:rFonts w:ascii="Arial" w:cs="Arial" w:eastAsia="Arial" w:hAnsi="Arial"/>
+          <w:rtl w:val="0"/>
+        </w:rPr>
+        <w:t xml:space="preserve">As releases de sprint devem seguir a seguinte nomenclatura:</w:t>
+      </w:r>
+    </w:p>
+    <w:p>
+      <w:pPr>
+        <w:ind w:firstLine="360"/>
+        <w:jc w:val="both"/>
+        <w:rPr>
+          <w:rFonts w:ascii="Arial" w:cs="Arial" w:eastAsia="Arial" w:hAnsi="Arial"/>
+        </w:rPr>
+      </w:pPr>
+      <w:r>
+        <w:rPr>
+          <w:rtl w:val="0"/>
+        </w:rPr>
+      </w:r>
+    </w:p>
+    <w:p>
+      <w:pPr>
+        <w:jc w:val="center"/>
+        <w:rPr>
+          <w:rFonts w:ascii="Arial" w:cs="Arial" w:eastAsia="Arial" w:hAnsi="Arial"/>
+        </w:rPr>
+      </w:pPr>
+      <w:r>
+        <w:rPr>
+          <w:rFonts w:ascii="Arial" w:cs="Arial" w:eastAsia="Arial" w:hAnsi="Arial"/>
+          <w:rtl w:val="0"/>
+        </w:rPr>
+        <w:t xml:space="preserve">R-ALG-v&lt;MAJOR&gt;.&lt;MINOR&gt;.&lt;PATCH&gt;</w:t>
+      </w:r>
+    </w:p>
+    <w:p>
+      <w:pPr>
+        <w:rPr>
+          <w:rFonts w:ascii="Arial" w:cs="Arial" w:eastAsia="Arial" w:hAnsi="Arial"/>
+        </w:rPr>
+      </w:pPr>
+      <w:r>
+        <w:rPr>
+          <w:rtl w:val="0"/>
+        </w:rPr>
+      </w:r>
+    </w:p>
+    <w:p>
+      <w:pPr>
+        <w:jc w:val="both"/>
+        <w:rPr>
+          <w:rFonts w:ascii="Arial" w:cs="Arial" w:eastAsia="Arial" w:hAnsi="Arial"/>
+        </w:rPr>
+      </w:pPr>
+      <w:r>
+        <w:rPr>
+          <w:rFonts w:ascii="Arial" w:cs="Arial" w:eastAsia="Arial" w:hAnsi="Arial"/>
+          <w:rtl w:val="0"/>
+        </w:rPr>
+        <w:t xml:space="preserve">Onde:</w:t>
+      </w:r>
+    </w:p>
+    <w:p>
+      <w:pPr>
+        <w:numPr>
+          <w:ilvl w:val="0"/>
+          <w:numId w:val="5"/>
+        </w:numPr>
+        <w:ind w:left="720" w:hanging="360"/>
+        <w:jc w:val="both"/>
+        <w:rPr>
+          <w:rFonts w:ascii="Arial" w:cs="Arial" w:eastAsia="Arial" w:hAnsi="Arial"/>
+        </w:rPr>
+      </w:pPr>
+      <w:r>
+        <w:rPr>
+          <w:rFonts w:ascii="Arial" w:cs="Arial" w:eastAsia="Arial" w:hAnsi="Arial"/>
+          <w:rtl w:val="0"/>
+        </w:rPr>
+        <w:t xml:space="preserve">MAJOR.MINOR.PATCH: O identificador da versão seguindo o versionamento semântico.</w:t>
+      </w:r>
+    </w:p>
+    <w:p>
+      <w:pPr>
+        <w:numPr>
+          <w:ilvl w:val="0"/>
+          <w:numId w:val="5"/>
+        </w:numPr>
+        <w:ind w:left="720" w:hanging="360"/>
+        <w:jc w:val="both"/>
+        <w:rPr>
+          <w:rFonts w:ascii="Arial" w:cs="Arial" w:eastAsia="Arial" w:hAnsi="Arial"/>
+        </w:rPr>
+      </w:pPr>
+      <w:r>
+        <w:rPr>
+          <w:rFonts w:ascii="Arial" w:cs="Arial" w:eastAsia="Arial" w:hAnsi="Arial"/>
+          <w:rtl w:val="0"/>
+        </w:rPr>
         <w:t xml:space="preserve">Exemplo: R-ALG-v1.0.0 (Release 1 do sistema AlumiGest).</w:t>
       </w:r>
       <w:r>
@@ -7004,14 +7391,328 @@
     </w:p>
     <w:p>
       <w:pPr>
-        <w:jc w:val="left"/>
-        <w:rPr>
-          <w:rFonts w:ascii="Arial" w:cs="Arial" w:eastAsia="Arial" w:hAnsi="Arial"/>
-          <w:vertAlign w:val="baseline"/>
-        </w:rPr>
-      </w:pPr>
-      <w:bookmarkStart w:colFirst="0" w:colLast="0" w:name="_jnovgs4j2sjk" w:id="41"/>
-      <w:bookmarkEnd w:id="41"/>
+        <w:jc w:val="both"/>
+        <w:rPr>
+          <w:rFonts w:ascii="Arial" w:cs="Arial" w:eastAsia="Arial" w:hAnsi="Arial"/>
+          <w:sz w:val="22"/>
+          <w:szCs w:val="22"/>
+        </w:rPr>
+      </w:pPr>
+      <w:r>
+        <w:rPr>
+          <w:rtl w:val="0"/>
+        </w:rPr>
+      </w:r>
+    </w:p>
+    <w:p>
+      <w:pPr>
+        <w:jc w:val="both"/>
+        <w:rPr>
+          <w:rFonts w:ascii="Arial" w:cs="Arial" w:eastAsia="Arial" w:hAnsi="Arial"/>
+          <w:sz w:val="22"/>
+          <w:szCs w:val="22"/>
+        </w:rPr>
+      </w:pPr>
+      <w:r>
+        <w:rPr>
+          <w:rtl w:val="0"/>
+        </w:rPr>
+      </w:r>
+    </w:p>
+    <w:p>
+      <w:pPr>
+        <w:jc w:val="both"/>
+        <w:rPr>
+          <w:rFonts w:ascii="Arial" w:cs="Arial" w:eastAsia="Arial" w:hAnsi="Arial"/>
+          <w:sz w:val="22"/>
+          <w:szCs w:val="22"/>
+        </w:rPr>
+      </w:pPr>
+      <w:r>
+        <w:rPr>
+          <w:rtl w:val="0"/>
+        </w:rPr>
+      </w:r>
+    </w:p>
+    <w:p>
+      <w:pPr>
+        <w:jc w:val="both"/>
+        <w:rPr>
+          <w:rFonts w:ascii="Arial" w:cs="Arial" w:eastAsia="Arial" w:hAnsi="Arial"/>
+          <w:sz w:val="22"/>
+          <w:szCs w:val="22"/>
+        </w:rPr>
+      </w:pPr>
+      <w:r>
+        <w:rPr>
+          <w:rtl w:val="0"/>
+        </w:rPr>
+      </w:r>
+    </w:p>
+    <w:p>
+      <w:pPr>
+        <w:jc w:val="both"/>
+        <w:rPr>
+          <w:rFonts w:ascii="Arial" w:cs="Arial" w:eastAsia="Arial" w:hAnsi="Arial"/>
+          <w:sz w:val="22"/>
+          <w:szCs w:val="22"/>
+        </w:rPr>
+      </w:pPr>
+      <w:r>
+        <w:rPr>
+          <w:rtl w:val="0"/>
+        </w:rPr>
+      </w:r>
+    </w:p>
+    <w:p>
+      <w:pPr>
+        <w:jc w:val="both"/>
+        <w:rPr>
+          <w:rFonts w:ascii="Arial" w:cs="Arial" w:eastAsia="Arial" w:hAnsi="Arial"/>
+          <w:sz w:val="22"/>
+          <w:szCs w:val="22"/>
+        </w:rPr>
+      </w:pPr>
+      <w:r>
+        <w:rPr>
+          <w:rtl w:val="0"/>
+        </w:rPr>
+      </w:r>
+    </w:p>
+    <w:p>
+      <w:pPr>
+        <w:jc w:val="both"/>
+        <w:rPr>
+          <w:rFonts w:ascii="Arial" w:cs="Arial" w:eastAsia="Arial" w:hAnsi="Arial"/>
+          <w:sz w:val="22"/>
+          <w:szCs w:val="22"/>
+        </w:rPr>
+      </w:pPr>
+      <w:r>
+        <w:rPr>
+          <w:rtl w:val="0"/>
+        </w:rPr>
+      </w:r>
+    </w:p>
+    <w:p>
+      <w:pPr>
+        <w:jc w:val="both"/>
+        <w:rPr>
+          <w:rFonts w:ascii="Arial" w:cs="Arial" w:eastAsia="Arial" w:hAnsi="Arial"/>
+          <w:sz w:val="22"/>
+          <w:szCs w:val="22"/>
+        </w:rPr>
+      </w:pPr>
+      <w:r>
+        <w:rPr>
+          <w:rtl w:val="0"/>
+        </w:rPr>
+      </w:r>
+    </w:p>
+    <w:p>
+      <w:pPr>
+        <w:jc w:val="both"/>
+        <w:rPr>
+          <w:rFonts w:ascii="Arial" w:cs="Arial" w:eastAsia="Arial" w:hAnsi="Arial"/>
+          <w:sz w:val="22"/>
+          <w:szCs w:val="22"/>
+        </w:rPr>
+      </w:pPr>
+      <w:r>
+        <w:rPr>
+          <w:rtl w:val="0"/>
+        </w:rPr>
+      </w:r>
+    </w:p>
+    <w:p>
+      <w:pPr>
+        <w:jc w:val="both"/>
+        <w:rPr>
+          <w:rFonts w:ascii="Arial" w:cs="Arial" w:eastAsia="Arial" w:hAnsi="Arial"/>
+          <w:sz w:val="22"/>
+          <w:szCs w:val="22"/>
+        </w:rPr>
+      </w:pPr>
+      <w:r>
+        <w:rPr>
+          <w:rtl w:val="0"/>
+        </w:rPr>
+      </w:r>
+    </w:p>
+    <w:p>
+      <w:pPr>
+        <w:jc w:val="both"/>
+        <w:rPr>
+          <w:rFonts w:ascii="Arial" w:cs="Arial" w:eastAsia="Arial" w:hAnsi="Arial"/>
+          <w:sz w:val="22"/>
+          <w:szCs w:val="22"/>
+        </w:rPr>
+      </w:pPr>
+      <w:r>
+        <w:rPr>
+          <w:rtl w:val="0"/>
+        </w:rPr>
+      </w:r>
+    </w:p>
+    <w:p>
+      <w:pPr>
+        <w:jc w:val="both"/>
+        <w:rPr>
+          <w:rFonts w:ascii="Arial" w:cs="Arial" w:eastAsia="Arial" w:hAnsi="Arial"/>
+          <w:sz w:val="22"/>
+          <w:szCs w:val="22"/>
+        </w:rPr>
+      </w:pPr>
+      <w:r>
+        <w:rPr>
+          <w:rtl w:val="0"/>
+        </w:rPr>
+      </w:r>
+    </w:p>
+    <w:p>
+      <w:pPr>
+        <w:jc w:val="both"/>
+        <w:rPr>
+          <w:rFonts w:ascii="Arial" w:cs="Arial" w:eastAsia="Arial" w:hAnsi="Arial"/>
+          <w:sz w:val="22"/>
+          <w:szCs w:val="22"/>
+        </w:rPr>
+      </w:pPr>
+      <w:r>
+        <w:rPr>
+          <w:rtl w:val="0"/>
+        </w:rPr>
+      </w:r>
+    </w:p>
+    <w:p>
+      <w:pPr>
+        <w:jc w:val="both"/>
+        <w:rPr>
+          <w:rFonts w:ascii="Arial" w:cs="Arial" w:eastAsia="Arial" w:hAnsi="Arial"/>
+          <w:sz w:val="22"/>
+          <w:szCs w:val="22"/>
+        </w:rPr>
+      </w:pPr>
+      <w:r>
+        <w:rPr>
+          <w:rtl w:val="0"/>
+        </w:rPr>
+      </w:r>
+    </w:p>
+    <w:p>
+      <w:pPr>
+        <w:jc w:val="both"/>
+        <w:rPr>
+          <w:rFonts w:ascii="Arial" w:cs="Arial" w:eastAsia="Arial" w:hAnsi="Arial"/>
+          <w:sz w:val="22"/>
+          <w:szCs w:val="22"/>
+        </w:rPr>
+      </w:pPr>
+      <w:r>
+        <w:rPr>
+          <w:rtl w:val="0"/>
+        </w:rPr>
+      </w:r>
+    </w:p>
+    <w:p>
+      <w:pPr>
+        <w:jc w:val="both"/>
+        <w:rPr>
+          <w:rFonts w:ascii="Arial" w:cs="Arial" w:eastAsia="Arial" w:hAnsi="Arial"/>
+          <w:sz w:val="22"/>
+          <w:szCs w:val="22"/>
+        </w:rPr>
+      </w:pPr>
+      <w:r>
+        <w:rPr>
+          <w:rtl w:val="0"/>
+        </w:rPr>
+      </w:r>
+    </w:p>
+    <w:p>
+      <w:pPr>
+        <w:jc w:val="both"/>
+        <w:rPr>
+          <w:rFonts w:ascii="Arial" w:cs="Arial" w:eastAsia="Arial" w:hAnsi="Arial"/>
+          <w:sz w:val="22"/>
+          <w:szCs w:val="22"/>
+        </w:rPr>
+      </w:pPr>
+      <w:r>
+        <w:rPr>
+          <w:rtl w:val="0"/>
+        </w:rPr>
+      </w:r>
+    </w:p>
+    <w:p>
+      <w:pPr>
+        <w:jc w:val="both"/>
+        <w:rPr>
+          <w:rFonts w:ascii="Arial" w:cs="Arial" w:eastAsia="Arial" w:hAnsi="Arial"/>
+          <w:sz w:val="22"/>
+          <w:szCs w:val="22"/>
+        </w:rPr>
+      </w:pPr>
+      <w:r>
+        <w:rPr>
+          <w:rtl w:val="0"/>
+        </w:rPr>
+      </w:r>
+    </w:p>
+    <w:p>
+      <w:pPr>
+        <w:jc w:val="both"/>
+        <w:rPr>
+          <w:rFonts w:ascii="Arial" w:cs="Arial" w:eastAsia="Arial" w:hAnsi="Arial"/>
+          <w:sz w:val="22"/>
+          <w:szCs w:val="22"/>
+        </w:rPr>
+      </w:pPr>
+      <w:r>
+        <w:rPr>
+          <w:rtl w:val="0"/>
+        </w:rPr>
+      </w:r>
+    </w:p>
+    <w:p>
+      <w:pPr>
+        <w:jc w:val="both"/>
+        <w:rPr>
+          <w:rFonts w:ascii="Arial" w:cs="Arial" w:eastAsia="Arial" w:hAnsi="Arial"/>
+          <w:sz w:val="22"/>
+          <w:szCs w:val="22"/>
+        </w:rPr>
+      </w:pPr>
+      <w:r>
+        <w:rPr>
+          <w:rtl w:val="0"/>
+        </w:rPr>
+      </w:r>
+    </w:p>
+    <w:p>
+      <w:pPr>
+        <w:jc w:val="both"/>
+        <w:rPr>
+          <w:rFonts w:ascii="Arial" w:cs="Arial" w:eastAsia="Arial" w:hAnsi="Arial"/>
+          <w:sz w:val="22"/>
+          <w:szCs w:val="22"/>
+        </w:rPr>
+      </w:pPr>
+      <w:r>
+        <w:rPr>
+          <w:rtl w:val="0"/>
+        </w:rPr>
+      </w:r>
+    </w:p>
+    <w:p>
+      <w:pPr>
+        <w:jc w:val="both"/>
+        <w:rPr>
+          <w:rFonts w:ascii="Arial" w:cs="Arial" w:eastAsia="Arial" w:hAnsi="Arial"/>
+          <w:sz w:val="22"/>
+          <w:szCs w:val="22"/>
+        </w:rPr>
+      </w:pPr>
       <w:r>
         <w:rPr>
           <w:rtl w:val="0"/>
@@ -7023,13 +7724,13 @@
         <w:pStyle w:val="Heading1"/>
         <w:numPr>
           <w:ilvl w:val="0"/>
-          <w:numId w:val="2"/>
+          <w:numId w:val="3"/>
         </w:numPr>
         <w:ind w:left="432" w:hanging="432"/>
         <w:rPr/>
       </w:pPr>
-      <w:bookmarkStart w:colFirst="0" w:colLast="0" w:name="_yg5bqt8tn5xn" w:id="42"/>
-      <w:bookmarkEnd w:id="42"/>
+      <w:bookmarkStart w:colFirst="0" w:colLast="0" w:name="_yg5bqt8tn5xn" w:id="53"/>
+      <w:bookmarkEnd w:id="53"/>
       <w:r>
         <w:rPr>
           <w:vertAlign w:val="baseline"/>
@@ -7048,7 +7749,7 @@
         <w:pStyle w:val="Heading2"/>
         <w:numPr>
           <w:ilvl w:val="1"/>
-          <w:numId w:val="2"/>
+          <w:numId w:val="3"/>
         </w:numPr>
         <w:ind w:left="576" w:hanging="576"/>
         <w:rPr/>
@@ -8994,10 +9695,17 @@
             <w:pPr>
               <w:rPr>
                 <w:rFonts w:ascii="Arial" w:cs="Arial" w:eastAsia="Arial" w:hAnsi="Arial"/>
-                <w:sz w:val="22"/>
-                <w:szCs w:val="22"/>
-              </w:rPr>
-            </w:pPr>
+                <w:sz w:val="20"/>
+                <w:szCs w:val="20"/>
+              </w:rPr>
+            </w:pPr>
+            <w:r>
+              <w:rPr>
+                <w:rFonts w:ascii="Arial" w:cs="Arial" w:eastAsia="Arial" w:hAnsi="Arial"/>
+                <w:rtl w:val="0"/>
+              </w:rPr>
+              <w:t xml:space="preserve">MS Office / Google Docs</w:t>
+            </w:r>
             <w:r>
               <w:rPr>
                 <w:rtl w:val="0"/>
@@ -9024,10 +9732,17 @@
             <w:pPr>
               <w:rPr>
                 <w:rFonts w:ascii="Arial" w:cs="Arial" w:eastAsia="Arial" w:hAnsi="Arial"/>
-                <w:sz w:val="22"/>
-                <w:szCs w:val="22"/>
-              </w:rPr>
-            </w:pPr>
+                <w:sz w:val="20"/>
+                <w:szCs w:val="20"/>
+              </w:rPr>
+            </w:pPr>
+            <w:r>
+              <w:rPr>
+                <w:rFonts w:ascii="Arial" w:cs="Arial" w:eastAsia="Arial" w:hAnsi="Arial"/>
+                <w:rtl w:val="0"/>
+              </w:rPr>
+              <w:t xml:space="preserve">Elaboração de documentos do projeto</w:t>
+            </w:r>
             <w:r>
               <w:rPr>
                 <w:rtl w:val="0"/>
@@ -9054,10 +9769,17 @@
             <w:pPr>
               <w:rPr>
                 <w:rFonts w:ascii="Arial" w:cs="Arial" w:eastAsia="Arial" w:hAnsi="Arial"/>
-                <w:sz w:val="22"/>
-                <w:szCs w:val="22"/>
-              </w:rPr>
-            </w:pPr>
+                <w:sz w:val="20"/>
+                <w:szCs w:val="20"/>
+              </w:rPr>
+            </w:pPr>
+            <w:r>
+              <w:rPr>
+                <w:rFonts w:ascii="Arial" w:cs="Arial" w:eastAsia="Arial" w:hAnsi="Arial"/>
+                <w:rtl w:val="0"/>
+              </w:rPr>
+              <w:t xml:space="preserve">Todos</w:t>
+            </w:r>
             <w:r>
               <w:rPr>
                 <w:rtl w:val="0"/>
@@ -9084,10 +9806,17 @@
             <w:pPr>
               <w:rPr>
                 <w:rFonts w:ascii="Arial" w:cs="Arial" w:eastAsia="Arial" w:hAnsi="Arial"/>
-                <w:sz w:val="22"/>
-                <w:szCs w:val="22"/>
-              </w:rPr>
-            </w:pPr>
+                <w:sz w:val="20"/>
+                <w:szCs w:val="20"/>
+              </w:rPr>
+            </w:pPr>
+            <w:r>
+              <w:rPr>
+                <w:rFonts w:ascii="Arial" w:cs="Arial" w:eastAsia="Arial" w:hAnsi="Arial"/>
+                <w:rtl w:val="0"/>
+              </w:rPr>
+              <w:t xml:space="preserve">Atual</w:t>
+            </w:r>
             <w:r>
               <w:rPr>
                 <w:rtl w:val="0"/>
@@ -9130,7 +9859,7 @@
                 <w:rFonts w:ascii="Arial" w:cs="Arial" w:eastAsia="Arial" w:hAnsi="Arial"/>
                 <w:rtl w:val="0"/>
               </w:rPr>
-              <w:t xml:space="preserve">MS Office / Google Docs</w:t>
+              <w:t xml:space="preserve">Google Stitch</w:t>
             </w:r>
             <w:r>
               <w:rPr>
@@ -9167,7 +9896,7 @@
                 <w:rFonts w:ascii="Arial" w:cs="Arial" w:eastAsia="Arial" w:hAnsi="Arial"/>
                 <w:rtl w:val="0"/>
               </w:rPr>
-              <w:t xml:space="preserve">Elaboração de documentos do projeto</w:t>
+              <w:t xml:space="preserve">Prototipação e design de interfaces</w:t>
             </w:r>
             <w:r>
               <w:rPr>
@@ -9204,7 +9933,7 @@
                 <w:rFonts w:ascii="Arial" w:cs="Arial" w:eastAsia="Arial" w:hAnsi="Arial"/>
                 <w:rtl w:val="0"/>
               </w:rPr>
-              <w:t xml:space="preserve">Todos</w:t>
+              <w:t xml:space="preserve">Design</w:t>
             </w:r>
             <w:r>
               <w:rPr>
@@ -9241,7 +9970,7 @@
                 <w:rFonts w:ascii="Arial" w:cs="Arial" w:eastAsia="Arial" w:hAnsi="Arial"/>
                 <w:rtl w:val="0"/>
               </w:rPr>
-              <w:t xml:space="preserve">Atual</w:t>
+              <w:t xml:space="preserve">Cloud</w:t>
             </w:r>
             <w:r>
               <w:rPr>
@@ -9276,21 +10005,14 @@
             <w:pPr>
               <w:rPr>
                 <w:rFonts w:ascii="Arial" w:cs="Arial" w:eastAsia="Arial" w:hAnsi="Arial"/>
-                <w:sz w:val="20"/>
-                <w:szCs w:val="20"/>
-              </w:rPr>
-            </w:pPr>
-            <w:r>
-              <w:rPr>
-                <w:rFonts w:ascii="Arial" w:cs="Arial" w:eastAsia="Arial" w:hAnsi="Arial"/>
-                <w:rtl w:val="0"/>
-              </w:rPr>
-              <w:t xml:space="preserve">Google Stitch</w:t>
-            </w:r>
-            <w:r>
-              <w:rPr>
-                <w:rtl w:val="0"/>
-              </w:rPr>
+              </w:rPr>
+            </w:pPr>
+            <w:r>
+              <w:rPr>
+                <w:rFonts w:ascii="Arial" w:cs="Arial" w:eastAsia="Arial" w:hAnsi="Arial"/>
+                <w:rtl w:val="0"/>
+              </w:rPr>
+              <w:t xml:space="preserve">Read.AI</w:t>
             </w:r>
           </w:p>
         </w:tc>
@@ -9313,21 +10035,14 @@
             <w:pPr>
               <w:rPr>
                 <w:rFonts w:ascii="Arial" w:cs="Arial" w:eastAsia="Arial" w:hAnsi="Arial"/>
-                <w:sz w:val="20"/>
-                <w:szCs w:val="20"/>
-              </w:rPr>
-            </w:pPr>
-            <w:r>
-              <w:rPr>
-                <w:rFonts w:ascii="Arial" w:cs="Arial" w:eastAsia="Arial" w:hAnsi="Arial"/>
-                <w:rtl w:val="0"/>
-              </w:rPr>
-              <w:t xml:space="preserve">Prototipação e design de interfaces</w:t>
-            </w:r>
-            <w:r>
-              <w:rPr>
-                <w:rtl w:val="0"/>
-              </w:rPr>
+              </w:rPr>
+            </w:pPr>
+            <w:r>
+              <w:rPr>
+                <w:rFonts w:ascii="Arial" w:cs="Arial" w:eastAsia="Arial" w:hAnsi="Arial"/>
+                <w:rtl w:val="0"/>
+              </w:rPr>
+              <w:t xml:space="preserve">Transcrições e geração de Atas de reunião</w:t>
             </w:r>
           </w:p>
         </w:tc>
@@ -9350,21 +10065,14 @@
             <w:pPr>
               <w:rPr>
                 <w:rFonts w:ascii="Arial" w:cs="Arial" w:eastAsia="Arial" w:hAnsi="Arial"/>
-                <w:sz w:val="20"/>
-                <w:szCs w:val="20"/>
-              </w:rPr>
-            </w:pPr>
-            <w:r>
-              <w:rPr>
-                <w:rFonts w:ascii="Arial" w:cs="Arial" w:eastAsia="Arial" w:hAnsi="Arial"/>
-                <w:rtl w:val="0"/>
-              </w:rPr>
-              <w:t xml:space="preserve">Design</w:t>
-            </w:r>
-            <w:r>
-              <w:rPr>
-                <w:rtl w:val="0"/>
-              </w:rPr>
+              </w:rPr>
+            </w:pPr>
+            <w:r>
+              <w:rPr>
+                <w:rFonts w:ascii="Arial" w:cs="Arial" w:eastAsia="Arial" w:hAnsi="Arial"/>
+                <w:rtl w:val="0"/>
+              </w:rPr>
+              <w:t xml:space="preserve">Documentação</w:t>
             </w:r>
           </w:p>
         </w:tc>
@@ -9387,21 +10095,14 @@
             <w:pPr>
               <w:rPr>
                 <w:rFonts w:ascii="Arial" w:cs="Arial" w:eastAsia="Arial" w:hAnsi="Arial"/>
-                <w:sz w:val="20"/>
-                <w:szCs w:val="20"/>
-              </w:rPr>
-            </w:pPr>
-            <w:r>
-              <w:rPr>
-                <w:rFonts w:ascii="Arial" w:cs="Arial" w:eastAsia="Arial" w:hAnsi="Arial"/>
-                <w:rtl w:val="0"/>
-              </w:rPr>
-              <w:t xml:space="preserve">Cloud</w:t>
-            </w:r>
-            <w:r>
-              <w:rPr>
-                <w:rtl w:val="0"/>
-              </w:rPr>
+              </w:rPr>
+            </w:pPr>
+            <w:r>
+              <w:rPr>
+                <w:rFonts w:ascii="Arial" w:cs="Arial" w:eastAsia="Arial" w:hAnsi="Arial"/>
+                <w:rtl w:val="0"/>
+              </w:rPr>
+              <w:t xml:space="preserve">Atual</w:t>
             </w:r>
           </w:p>
         </w:tc>
@@ -9413,8 +10114,8 @@
           <w:rFonts w:ascii="Arial" w:cs="Arial" w:eastAsia="Arial" w:hAnsi="Arial"/>
         </w:rPr>
       </w:pPr>
-      <w:bookmarkStart w:colFirst="0" w:colLast="0" w:name="_b312i1sb4lou" w:id="43"/>
-      <w:bookmarkEnd w:id="43"/>
+      <w:bookmarkStart w:colFirst="0" w:colLast="0" w:name="_b312i1sb4lou" w:id="54"/>
+      <w:bookmarkEnd w:id="54"/>
       <w:r>
         <w:rPr>
           <w:rtl w:val="0"/>
@@ -9426,7 +10127,7 @@
         <w:pStyle w:val="Heading1"/>
         <w:numPr>
           <w:ilvl w:val="0"/>
-          <w:numId w:val="2"/>
+          <w:numId w:val="3"/>
         </w:numPr>
         <w:ind w:left="432" w:hanging="432"/>
         <w:rPr/>
@@ -10212,7 +10913,7 @@
             <w:rPr>
               <w:rtl w:val="0"/>
             </w:rPr>
-            <w:t xml:space="preserve">0</w:t>
+            <w:t xml:space="preserve">1</w:t>
           </w:r>
           <w:r>
             <w:rPr>
@@ -10265,13 +10966,26 @@
               <w:vertAlign w:val="baseline"/>
               <w:rtl w:val="0"/>
             </w:rPr>
-            <w:t xml:space="preserve">Data/Hora: 03/08/20</w:t>
+            <w:t xml:space="preserve">Data/Hora: 0</w:t>
           </w:r>
           <w:r>
             <w:rPr>
               <w:rtl w:val="0"/>
             </w:rPr>
-            <w:t xml:space="preserve">26 - 17:28</w:t>
+            <w:t xml:space="preserve">5</w:t>
+          </w:r>
+          <w:r>
+            <w:rPr>
+              <w:vertAlign w:val="baseline"/>
+              <w:rtl w:val="0"/>
+            </w:rPr>
+            <w:t xml:space="preserve">/08/20</w:t>
+          </w:r>
+          <w:r>
+            <w:rPr>
+              <w:rtl w:val="0"/>
+            </w:rPr>
+            <w:t xml:space="preserve">26 - 11:57</w:t>
           </w:r>
           <w:r>
             <w:rPr>
@@ -10442,6 +11156,116 @@
   <w:abstractNum w:abstractNumId="2">
     <w:lvl w:ilvl="0">
       <w:start w:val="1"/>
+      <w:numFmt w:val="bullet"/>
+      <w:lvlText w:val="●"/>
+      <w:lvlJc w:val="left"/>
+      <w:pPr>
+        <w:ind w:left="720" w:hanging="360"/>
+      </w:pPr>
+      <w:rPr>
+        <w:u w:val="none"/>
+      </w:rPr>
+    </w:lvl>
+    <w:lvl w:ilvl="1">
+      <w:start w:val="1"/>
+      <w:numFmt w:val="bullet"/>
+      <w:lvlText w:val="○"/>
+      <w:lvlJc w:val="left"/>
+      <w:pPr>
+        <w:ind w:left="1440" w:hanging="360"/>
+      </w:pPr>
+      <w:rPr>
+        <w:u w:val="none"/>
+      </w:rPr>
+    </w:lvl>
+    <w:lvl w:ilvl="2">
+      <w:start w:val="1"/>
+      <w:numFmt w:val="bullet"/>
+      <w:lvlText w:val="■"/>
+      <w:lvlJc w:val="left"/>
+      <w:pPr>
+        <w:ind w:left="2160" w:hanging="360"/>
+      </w:pPr>
+      <w:rPr>
+        <w:u w:val="none"/>
+      </w:rPr>
+    </w:lvl>
+    <w:lvl w:ilvl="3">
+      <w:start w:val="1"/>
+      <w:numFmt w:val="bullet"/>
+      <w:lvlText w:val="●"/>
+      <w:lvlJc w:val="left"/>
+      <w:pPr>
+        <w:ind w:left="2880" w:hanging="360"/>
+      </w:pPr>
+      <w:rPr>
+        <w:u w:val="none"/>
+      </w:rPr>
+    </w:lvl>
+    <w:lvl w:ilvl="4">
+      <w:start w:val="1"/>
+      <w:numFmt w:val="bullet"/>
+      <w:lvlText w:val="○"/>
+      <w:lvlJc w:val="left"/>
+      <w:pPr>
+        <w:ind w:left="3600" w:hanging="360"/>
+      </w:pPr>
+      <w:rPr>
+        <w:u w:val="none"/>
+      </w:rPr>
+    </w:lvl>
+    <w:lvl w:ilvl="5">
+      <w:start w:val="1"/>
+      <w:numFmt w:val="bullet"/>
+      <w:lvlText w:val="■"/>
+      <w:lvlJc w:val="left"/>
+      <w:pPr>
+        <w:ind w:left="4320" w:hanging="360"/>
+      </w:pPr>
+      <w:rPr>
+        <w:u w:val="none"/>
+      </w:rPr>
+    </w:lvl>
+    <w:lvl w:ilvl="6">
+      <w:start w:val="1"/>
+      <w:numFmt w:val="bullet"/>
+      <w:lvlText w:val="●"/>
+      <w:lvlJc w:val="left"/>
+      <w:pPr>
+        <w:ind w:left="5040" w:hanging="360"/>
+      </w:pPr>
+      <w:rPr>
+        <w:u w:val="none"/>
+      </w:rPr>
+    </w:lvl>
+    <w:lvl w:ilvl="7">
+      <w:start w:val="1"/>
+      <w:numFmt w:val="bullet"/>
+      <w:lvlText w:val="○"/>
+      <w:lvlJc w:val="left"/>
+      <w:pPr>
+        <w:ind w:left="5760" w:hanging="360"/>
+      </w:pPr>
+      <w:rPr>
+        <w:u w:val="none"/>
+      </w:rPr>
+    </w:lvl>
+    <w:lvl w:ilvl="8">
+      <w:start w:val="1"/>
+      <w:numFmt w:val="bullet"/>
+      <w:lvlText w:val="■"/>
+      <w:lvlJc w:val="left"/>
+      <w:pPr>
+        <w:ind w:left="6480" w:hanging="360"/>
+      </w:pPr>
+      <w:rPr>
+        <w:u w:val="none"/>
+      </w:rPr>
+    </w:lvl>
+  </w:abstractNum>
+  <w:abstractNum w:abstractNumId="3">
+    <w:lvl w:ilvl="0">
+      <w:start w:val="1"/>
       <w:numFmt w:val="decimal"/>
       <w:lvlText w:val="%1"/>
       <w:lvlJc w:val="left"/>
@@ -10549,7 +11373,7 @@
       </w:rPr>
     </w:lvl>
   </w:abstractNum>
-  <w:abstractNum w:abstractNumId="3">
+  <w:abstractNum w:abstractNumId="4">
     <w:lvl w:ilvl="0">
       <w:start w:val="1"/>
       <w:numFmt w:val="bullet"/>
@@ -10668,7 +11492,7 @@
       </w:rPr>
     </w:lvl>
   </w:abstractNum>
-  <w:abstractNum w:abstractNumId="4">
+  <w:abstractNum w:abstractNumId="5">
     <w:lvl w:ilvl="0">
       <w:start w:val="1"/>
       <w:numFmt w:val="bullet"/>
@@ -10789,6 +11613,9 @@
   </w:num>
   <w:num w:numId="4">
     <w:abstractNumId w:val="4"/>
+  </w:num>
+  <w:num w:numId="5">
+    <w:abstractNumId w:val="5"/>
   </w:num>
 </w:numbering>
 </file>

</xml_diff>